<commit_message>
Auto commit (2026-09-15 18:57) — 2 changes
Claude Code 세션 종료 시 자동 커밋.

Co-Authored-By: Claude <noreply@anthropic.com>
</commit_message>
<xml_diff>
--- a/projects/34_storm_dragon_bride/07_final/34_storm_dragon_bride_FINAL_v2_CN&EN.docx
+++ b/projects/34_storm_dragon_bride/07_final/34_storm_dragon_bride_FINAL_v2_CN&EN.docx
@@ -103,7 +103,7 @@
         <w:t xml:space="preserve">비비안 Vivian  </w:t>
       </w:r>
       <w:r>
-        <w:t>왕의 친딸이자 노라의 의붓동생. 대신 보낸 신랑이 미남임을 알자, 가짜 신부라며 노라의 자리를 빼앗으려 한다.</w:t>
+        <w:t>왕의 친딸이자 노라의 의붓동생. 노라에게 떠넘긴 신랑이 미남임을 알자, 가짜 신부라며 노라의 자리를 빼앗으려 한다.</w:t>
       </w:r>
     </w:p>
     <w:p>
@@ -9470,18 +9470,6 @@
       <w:r>
         <w:t>△ 【定格】画面在红金色的微光、湛蓝的海水、以及诺拉和达蒙的拥吻迎着刺眼的阳光渐渐泛白淡出。</w:t>
       </w:r>
-    </w:p>
-    <w:p>
-      <w:r/>
-    </w:p>
-    <w:p>
-      <w:r/>
-    </w:p>
-    <w:p>
-      <w:r/>
-    </w:p>
-    <w:p>
-      <w:r/>
     </w:p>
     <w:sectPr>
       <w:footerReference w:type="default" r:id="rId9"/>

</xml_diff>

<commit_message>
정기 커밋 오후 (2026-09-15 21:00:07) - 3건
변경: projects
</commit_message>
<xml_diff>
--- a/projects/34_storm_dragon_bride/07_final/34_storm_dragon_bride_FINAL_v2_CN&EN.docx
+++ b/projects/34_storm_dragon_bride/07_final/34_storm_dragon_bride_FINAL_v2_CN&EN.docx
@@ -2670,7 +2670,7 @@
     </w:p>
     <w:p>
       <w:r>
-        <w:t>△“烧死她！烧死她！”的呼声在大殿内此起彼伏。</w:t>
+        <w:t>△“Burn her alive! Burn her alive!”（烧死她！烧死她！）的呼声在大殿内此起彼伏。</w:t>
       </w:r>
     </w:p>
     <w:p>
@@ -10205,9 +10205,6 @@
     <w:rsid w:val="00FC693F"/>
     <w:pPr>
       <w:keepNext/>
-      <w:pBdr>
-        <w:bottom w:val="single" w:sz="8" w:space="4" w:color="4F81BD" w:themeColor="accent1"/>
-      </w:pBdr>
       <w:spacing w:after="80" w:line="240" w:lineRule="auto" w:before="180"/>
       <w:contextualSpacing/>
     </w:pPr>

</xml_diff>